<commit_message>
updated vacancy announcement and added removed about section
</commit_message>
<xml_diff>
--- a/public/files/ZHMBC_Pastoral_Vacancy_Announcment.docx
+++ b/public/files/ZHMBC_Pastoral_Vacancy_Announcment.docx
@@ -243,7 +243,68 @@
         <w:t>Education:</w:t>
       </w:r>
       <w:r>
-        <w:t xml:space="preserve"> Bachelor’s degree and/or accredited seminary degree preferred.</w:t>
+        <w:t xml:space="preserve"> </w:t>
+      </w:r>
+      <w:r>
+        <w:rPr>
+          <w:sz w:val="22"/>
+          <w:szCs w:val="22"/>
+        </w:rPr>
+        <w:t>Bachelor’s degree</w:t>
+      </w:r>
+      <w:r>
+        <w:rPr>
+          <w:sz w:val="22"/>
+          <w:szCs w:val="22"/>
+        </w:rPr>
+        <w:t xml:space="preserve"> </w:t>
+      </w:r>
+      <w:r>
+        <w:t>(</w:t>
+      </w:r>
+      <w:r>
+        <w:rPr>
+          <w:b/>
+          <w:bCs/>
+          <w:sz w:val="22"/>
+          <w:szCs w:val="22"/>
+        </w:rPr>
+        <w:t>optional</w:t>
+      </w:r>
+      <w:r>
+        <w:rPr>
+          <w:sz w:val="22"/>
+          <w:szCs w:val="22"/>
+        </w:rPr>
+        <w:t>)</w:t>
+      </w:r>
+      <w:r>
+        <w:rPr>
+          <w:sz w:val="22"/>
+          <w:szCs w:val="22"/>
+        </w:rPr>
+        <w:t xml:space="preserve"> and/or accredited seminary </w:t>
+      </w:r>
+      <w:r>
+        <w:t xml:space="preserve">degree </w:t>
+      </w:r>
+      <w:r>
+        <w:t>(</w:t>
+      </w:r>
+      <w:r>
+        <w:rPr>
+          <w:b/>
+          <w:bCs/>
+          <w:sz w:val="22"/>
+          <w:szCs w:val="22"/>
+        </w:rPr>
+        <w:t>preferred</w:t>
+      </w:r>
+      <w:r>
+        <w:t>)</w:t>
+      </w:r>
+      <w:r>
+        <w:t>.</w:t>
       </w:r>
     </w:p>
     <w:p>
@@ -281,7 +342,7 @@
         <w:t>Skills:</w:t>
       </w:r>
       <w:r>
-        <w:t xml:space="preserve"> Strong church administration, organizational, and leadership abilities; effective written and oral communication; and excellent technological proficiency.</w:t>
+        <w:t xml:space="preserve"> Strong church administration, organizational, leadership; effective written and oral communication; and technological proficiency.</w:t>
       </w:r>
     </w:p>
     <w:p>
@@ -610,7 +671,10 @@
         <w:t>Call to Ministry:</w:t>
       </w:r>
       <w:r>
-        <w:t xml:space="preserve"> A written statement articulating your call to full-time ministry (Max 1 page).</w:t>
+        <w:t xml:space="preserve"> </w:t>
+      </w:r>
+      <w:r>
+        <w:t>A written statement articulating your call to full-time ministry (Max 1 page).</w:t>
       </w:r>
     </w:p>
     <w:p>
@@ -686,7 +750,31 @@
         <w:t>Recommendations:</w:t>
       </w:r>
       <w:r>
-        <w:t xml:space="preserve"> Six (6) letters (2 Clergy, 2 Personal, 2 Laypersons).</w:t>
+        <w:t xml:space="preserve"> </w:t>
+      </w:r>
+      <w:r>
+        <w:t>Three (3</w:t>
+      </w:r>
+      <w:r>
+        <w:t>) letters (</w:t>
+      </w:r>
+      <w:r>
+        <w:t>1</w:t>
+      </w:r>
+      <w:r>
+        <w:t xml:space="preserve"> Clergy, </w:t>
+      </w:r>
+      <w:r>
+        <w:t>1</w:t>
+      </w:r>
+      <w:r>
+        <w:t xml:space="preserve"> Personal, </w:t>
+      </w:r>
+      <w:r>
+        <w:t>1</w:t>
+      </w:r>
+      <w:r>
+        <w:t xml:space="preserve"> Laypersons).</w:t>
       </w:r>
     </w:p>
     <w:p>
@@ -884,7 +972,15 @@
           <w:bCs/>
           <w:highlight w:val="yellow"/>
         </w:rPr>
-        <w:t>March 31, 2026</w:t>
+        <w:t>April 22</w:t>
+      </w:r>
+      <w:r>
+        <w:rPr>
+          <w:b/>
+          <w:bCs/>
+          <w:highlight w:val="yellow"/>
+        </w:rPr>
+        <w:t>, 2026</w:t>
       </w:r>
       <w:r>
         <w:rPr>

</xml_diff>